<commit_message>
se corrigiio el oficio para informe medico
</commit_message>
<xml_diff>
--- a/plantillas/oficio_informe_medico.docx
+++ b/plantillas/oficio_informe_medico.docx
@@ -198,6 +198,87 @@
     </w:p>
     <w:p>
       <w:pPr>
+        <w:jc w:val="both"/>
+        <w:rPr>
+          <w:rFonts w:ascii="Impact" w:eastAsia="Calibri" w:hAnsi="Impact"/>
+          <w:spacing w:val="-20"/>
+          <w:sz w:val="32"/>
+          <w:szCs w:val="32"/>
+          <w:u w:val="single"/>
+          <w:lang w:val="pt-PT" w:eastAsia="en-US"/>
+        </w:rPr>
+      </w:pPr>
+      <w:bookmarkStart w:id="0" w:name="_Hlk164362227"/>
+      <w:r>
+        <w:rPr>
+          <w:rFonts w:ascii="Impact" w:eastAsia="Calibri" w:hAnsi="Impact"/>
+          <w:spacing w:val="-20"/>
+          <w:sz w:val="32"/>
+          <w:szCs w:val="32"/>
+          <w:u w:val="single"/>
+          <w:lang w:val="pt-PT" w:eastAsia="en-US"/>
+        </w:rPr>
+        <w:t xml:space="preserve">OFICIO N.º </w:t>
+      </w:r>
+      <w:r>
+        <w:rPr>
+          <w:rFonts w:ascii="Impact" w:eastAsia="Calibri" w:hAnsi="Impact"/>
+          <w:spacing w:val="-20"/>
+          <w:sz w:val="32"/>
+          <w:szCs w:val="32"/>
+          <w:u w:val="single"/>
+          <w:lang w:val="pt-PT" w:eastAsia="en-US"/>
+        </w:rPr>
+        <w:t>${oficio_numero_completo}</w:t>
+      </w:r>
+      <w:r>
+        <w:rPr>
+          <w:rFonts w:ascii="Impact" w:eastAsia="Calibri" w:hAnsi="Impact"/>
+          <w:spacing w:val="-20"/>
+          <w:sz w:val="32"/>
+          <w:szCs w:val="32"/>
+          <w:u w:val="single"/>
+          <w:lang w:val="pt-PT" w:eastAsia="en-US"/>
+        </w:rPr>
+        <w:t>-COMOPPOL-DIRNOS-PNP/DIRTTSV-DIVPIAT-</w:t>
+      </w:r>
+      <w:r>
+        <w:rPr>
+          <w:rFonts w:ascii="Impact" w:eastAsia="Calibri" w:hAnsi="Impact"/>
+          <w:spacing w:val="-20"/>
+          <w:sz w:val="32"/>
+          <w:szCs w:val="32"/>
+          <w:u w:val="single"/>
+          <w:lang w:val="pt-PT" w:eastAsia="en-US"/>
+        </w:rPr>
+        <w:t>DEPIAT</w:t>
+      </w:r>
+      <w:r>
+        <w:rPr>
+          <w:rFonts w:ascii="Impact" w:eastAsia="Calibri" w:hAnsi="Impact"/>
+          <w:spacing w:val="-20"/>
+          <w:sz w:val="32"/>
+          <w:szCs w:val="32"/>
+          <w:u w:val="single"/>
+          <w:lang w:val="pt-PT" w:eastAsia="en-US"/>
+        </w:rPr>
+        <w:t>-</w:t>
+      </w:r>
+      <w:r>
+        <w:rPr>
+          <w:rFonts w:ascii="Impact" w:eastAsia="Calibri" w:hAnsi="Impact"/>
+          <w:spacing w:val="-20"/>
+          <w:sz w:val="32"/>
+          <w:szCs w:val="32"/>
+          <w:u w:val="single"/>
+          <w:lang w:val="pt-PT" w:eastAsia="en-US"/>
+        </w:rPr>
+        <w:t>NORTE</w:t>
+      </w:r>
+    </w:p>
+    <w:bookmarkEnd w:id="0"/>
+    <w:p>
+      <w:pPr>
         <w:ind w:right="-284"/>
         <w:jc w:val="both"/>
         <w:rPr>
@@ -209,39 +290,6 @@
           <w:lang w:val="pt-PT"/>
         </w:rPr>
       </w:pPr>
-      <w:r>
-        <w:rPr>
-          <w:rFonts w:ascii="Impact" w:hAnsi="Impact" w:cs="Arial"/>
-          <w:color w:val="000000" w:themeColor="text1"/>
-          <w:sz w:val="32"/>
-          <w:szCs w:val="32"/>
-          <w:u w:val="single"/>
-          <w:lang w:val="pt-PT"/>
-        </w:rPr>
-        <w:t xml:space="preserve">OFICIO Nº </w:t>
-      </w:r>
-      <w:r>
-        <w:rPr>
-          <w:rFonts w:ascii="Impact" w:hAnsi="Impact" w:cs="Arial"/>
-          <w:color w:val="000000" w:themeColor="text1"/>
-          <w:sz w:val="32"/>
-          <w:szCs w:val="32"/>
-          <w:u w:val="single"/>
-          <w:lang w:val="pt-PT"/>
-        </w:rPr>
-        <w:t>${oficio_numero_completo}</w:t>
-      </w:r>
-      <w:r>
-        <w:rPr>
-          <w:rFonts w:ascii="Impact" w:hAnsi="Impact" w:cs="Arial"/>
-          <w:color w:val="000000" w:themeColor="text1"/>
-          <w:sz w:val="32"/>
-          <w:szCs w:val="32"/>
-          <w:u w:val="single"/>
-          <w:lang w:val="pt-PT"/>
-        </w:rPr>
-        <w:t>-DIRNOS-DIRTTSV/DIVPIAT-UIAT-NORTE.</w:t>
-      </w:r>
     </w:p>
     <w:p>
       <w:pPr>
@@ -376,14 +424,6 @@
           <w:lang w:val="pt-PT"/>
         </w:rPr>
         <w:tab/>
-      </w:r>
-      <w:r>
-        <w:rPr>
-          <w:b/>
-          <w:bCs/>
-          <w:color w:val="000000" w:themeColor="text1"/>
-          <w:lang w:val="pt-PT"/>
-        </w:rPr>
         <w:t>${oficio_entidad_nombre}</w:t>
       </w:r>
     </w:p>

</xml_diff>

<commit_message>
se corrigio oficio informe medico
</commit_message>
<xml_diff>
--- a/plantillas/oficio_informe_medico.docx
+++ b/plantillas/oficio_informe_medico.docx
@@ -95,27 +95,7 @@
           <w:iCs/>
           <w:lang w:eastAsia="en-US"/>
         </w:rPr>
-        <w:t>${</w:t>
-      </w:r>
-      <w:proofErr w:type="spellStart"/>
-      <w:r>
-        <w:rPr>
-          <w:rFonts w:asciiTheme="minorHAnsi" w:eastAsiaTheme="minorHAnsi" w:hAnsiTheme="minorHAnsi" w:cstheme="minorHAnsi"/>
-          <w:i/>
-          <w:iCs/>
-          <w:lang w:eastAsia="en-US"/>
-        </w:rPr>
-        <w:t>nombre_oficial_ano</w:t>
-      </w:r>
-      <w:proofErr w:type="spellEnd"/>
-      <w:r>
-        <w:rPr>
-          <w:rFonts w:asciiTheme="minorHAnsi" w:eastAsiaTheme="minorHAnsi" w:hAnsiTheme="minorHAnsi" w:cstheme="minorHAnsi"/>
-          <w:i/>
-          <w:iCs/>
-          <w:lang w:eastAsia="en-US"/>
-        </w:rPr>
-        <w:t>}</w:t>
+        <w:t>${nombre_oficial_ano}</w:t>
       </w:r>
     </w:p>
     <w:p>
@@ -886,7 +866,7 @@
           <w:color w:val="000000" w:themeColor="text1"/>
           <w:sz w:val="24"/>
         </w:rPr>
-        <w:t>16JUL2025</w:t>
+        <w:t>${accidente_fecha_abrev}</w:t>
       </w:r>
       <w:r>
         <w:rPr>
@@ -904,17 +884,7 @@
           <w:color w:val="000000" w:themeColor="text1"/>
           <w:sz w:val="24"/>
         </w:rPr>
-        <w:t>1</w:t>
-      </w:r>
-      <w:r>
-        <w:rPr>
-          <w:rFonts w:ascii="Arial" w:hAnsi="Arial"/>
-          <w:b/>
-          <w:bCs/>
-          <w:color w:val="000000" w:themeColor="text1"/>
-          <w:sz w:val="24"/>
-        </w:rPr>
-        <w:t>8:10</w:t>
+        <w:t>${accidente_hora}</w:t>
       </w:r>
       <w:r>
         <w:rPr>
@@ -1053,25 +1023,7 @@
           <w:color w:val="000000" w:themeColor="text1"/>
           <w:sz w:val="24"/>
         </w:rPr>
-        <w:t>${</w:t>
-      </w:r>
-      <w:proofErr w:type="spellStart"/>
-      <w:r>
-        <w:rPr>
-          <w:rFonts w:ascii="Arial" w:hAnsi="Arial"/>
-          <w:color w:val="000000" w:themeColor="text1"/>
-          <w:sz w:val="24"/>
-        </w:rPr>
-        <w:t>fiscalia_nombre</w:t>
-      </w:r>
-      <w:proofErr w:type="spellEnd"/>
-      <w:r>
-        <w:rPr>
-          <w:rFonts w:ascii="Arial" w:hAnsi="Arial"/>
-          <w:color w:val="000000" w:themeColor="text1"/>
-          <w:sz w:val="24"/>
-        </w:rPr>
-        <w:t>}</w:t>
+        <w:t>${fiscalia_nombre}</w:t>
       </w:r>
       <w:r>
         <w:rPr>
@@ -1873,7 +1825,6 @@
                                 <w:szCs w:val="18"/>
                               </w:rPr>
                             </w:pPr>
-                            <w:proofErr w:type="spellStart"/>
                             <w:r>
                               <w:rPr>
                                 <w:rFonts w:ascii="Arial Narrow" w:eastAsia="Arial Unicode MS" w:hAnsi="Arial Narrow"/>
@@ -1883,19 +1834,7 @@
                                 <w:sz w:val="18"/>
                                 <w:szCs w:val="18"/>
                               </w:rPr>
-                              <w:t>Jose</w:t>
-                            </w:r>
-                            <w:proofErr w:type="spellEnd"/>
-                            <w:r>
-                              <w:rPr>
-                                <w:rFonts w:ascii="Arial Narrow" w:eastAsia="Arial Unicode MS" w:hAnsi="Arial Narrow"/>
-                                <w:b/>
-                                <w:bCs/>
-                                <w:color w:val="000000"/>
-                                <w:sz w:val="18"/>
-                                <w:szCs w:val="18"/>
-                              </w:rPr>
-                              <w:t xml:space="preserve"> Antonio SUASNABAR VIDARTE</w:t>
+                              <w:t>Jose Antonio SUASNABAR VIDARTE</w:t>
                             </w:r>
                           </w:p>
                           <w:p>
@@ -2049,7 +1988,6 @@
                           <w:szCs w:val="18"/>
                         </w:rPr>
                       </w:pPr>
-                      <w:proofErr w:type="spellStart"/>
                       <w:r>
                         <w:rPr>
                           <w:rFonts w:ascii="Arial Narrow" w:eastAsia="Arial Unicode MS" w:hAnsi="Arial Narrow"/>
@@ -2059,19 +1997,7 @@
                           <w:sz w:val="18"/>
                           <w:szCs w:val="18"/>
                         </w:rPr>
-                        <w:t>Jose</w:t>
-                      </w:r>
-                      <w:proofErr w:type="spellEnd"/>
-                      <w:r>
-                        <w:rPr>
-                          <w:rFonts w:ascii="Arial Narrow" w:eastAsia="Arial Unicode MS" w:hAnsi="Arial Narrow"/>
-                          <w:b/>
-                          <w:bCs/>
-                          <w:color w:val="000000"/>
-                          <w:sz w:val="18"/>
-                          <w:szCs w:val="18"/>
-                        </w:rPr>
-                        <w:t xml:space="preserve"> Antonio SUASNABAR VIDARTE</w:t>
+                        <w:t>Jose Antonio SUASNABAR VIDARTE</w:t>
                       </w:r>
                     </w:p>
                     <w:p>
@@ -2947,13 +2873,8 @@
                             <w:jc w:val="center"/>
                           </w:pPr>
                           <w:r>
-                            <w:t xml:space="preserve">Dirección de </w:t>
+                            <w:t>Dirección de Transito</w:t>
                           </w:r>
-                          <w:proofErr w:type="spellStart"/>
-                          <w:r>
-                            <w:t>Transito</w:t>
-                          </w:r>
-                          <w:proofErr w:type="spellEnd"/>
                           <w:r>
                             <w:t xml:space="preserve"> Transporte y Seguridad Vial</w:t>
                           </w:r>
@@ -2985,13 +2906,8 @@
                       <w:jc w:val="center"/>
                     </w:pPr>
                     <w:r>
-                      <w:t xml:space="preserve">Dirección de </w:t>
+                      <w:t>Dirección de Transito</w:t>
                     </w:r>
-                    <w:proofErr w:type="spellStart"/>
-                    <w:r>
-                      <w:t>Transito</w:t>
-                    </w:r>
-                    <w:proofErr w:type="spellEnd"/>
                     <w:r>
                       <w:t xml:space="preserve"> Transporte y Seguridad Vial</w:t>
                     </w:r>

</xml_diff>